<commit_message>
hoàn thành học phần lap trình mobile
</commit_message>
<xml_diff>
--- a/lap-trinh-ung-dung-mobile/srs/SRS-LHU-Food.docx
+++ b/lap-trinh-ung-dung-mobile/srs/SRS-LHU-Food.docx
@@ -130,7 +130,6 @@
           <w:color w:val="013D88"/>
           <w:sz w:val="36"/>
         </w:rPr>
-        <w:lastRenderedPageBreak/>
         <w:t>MỤC LỤC</w:t>
       </w:r>
     </w:p>
@@ -158,7 +157,7 @@
       <w:r>
         <w:fldChar w:fldCharType="separate"/>
       </w:r>
-      <w:hyperlink w:anchor="_Toc244207437" w:history="1">
+      <w:hyperlink w:anchor="_Toc244237087" w:history="1">
         <w:r>
           <w:rPr>
             <w:rStyle w:val="Hyperlink"/>
@@ -185,7 +184,7 @@
             <w:noProof/>
             <w:webHidden/>
           </w:rPr>
-          <w:instrText xml:space="preserve"> PAGEREF _Toc244207437 \h </w:instrText>
+          <w:instrText xml:space="preserve"> PAGEREF _Toc244237087 \h </w:instrText>
         </w:r>
         <w:r>
           <w:rPr>
@@ -231,7 +230,7 @@
           <w14:ligatures w14:val="standardContextual"/>
         </w:rPr>
       </w:pPr>
-      <w:hyperlink w:anchor="_Toc244207438" w:history="1">
+      <w:hyperlink w:anchor="_Toc244237088" w:history="1">
         <w:r>
           <w:rPr>
             <w:rStyle w:val="Hyperlink"/>
@@ -258,7 +257,7 @@
             <w:noProof/>
             <w:webHidden/>
           </w:rPr>
-          <w:instrText xml:space="preserve"> PAGEREF _Toc244207438 \h </w:instrText>
+          <w:instrText xml:space="preserve"> PAGEREF _Toc244237088 \h </w:instrText>
         </w:r>
         <w:r>
           <w:rPr>
@@ -304,7 +303,7 @@
           <w14:ligatures w14:val="standardContextual"/>
         </w:rPr>
       </w:pPr>
-      <w:hyperlink w:anchor="_Toc244207439" w:history="1">
+      <w:hyperlink w:anchor="_Toc244237089" w:history="1">
         <w:r>
           <w:rPr>
             <w:rStyle w:val="Hyperlink"/>
@@ -331,7 +330,7 @@
             <w:noProof/>
             <w:webHidden/>
           </w:rPr>
-          <w:instrText xml:space="preserve"> PAGEREF _Toc244207439 \h </w:instrText>
+          <w:instrText xml:space="preserve"> PAGEREF _Toc244237089 \h </w:instrText>
         </w:r>
         <w:r>
           <w:rPr>
@@ -377,7 +376,7 @@
           <w14:ligatures w14:val="standardContextual"/>
         </w:rPr>
       </w:pPr>
-      <w:hyperlink w:anchor="_Toc244207440" w:history="1">
+      <w:hyperlink w:anchor="_Toc244237090" w:history="1">
         <w:r>
           <w:rPr>
             <w:rStyle w:val="Hyperlink"/>
@@ -404,7 +403,7 @@
             <w:noProof/>
             <w:webHidden/>
           </w:rPr>
-          <w:instrText xml:space="preserve"> PAGEREF _Toc244207440 \h </w:instrText>
+          <w:instrText xml:space="preserve"> PAGEREF _Toc244237090 \h </w:instrText>
         </w:r>
         <w:r>
           <w:rPr>
@@ -450,7 +449,7 @@
           <w14:ligatures w14:val="standardContextual"/>
         </w:rPr>
       </w:pPr>
-      <w:hyperlink w:anchor="_Toc244207441" w:history="1">
+      <w:hyperlink w:anchor="_Toc244237091" w:history="1">
         <w:r>
           <w:rPr>
             <w:rStyle w:val="Hyperlink"/>
@@ -477,7 +476,7 @@
             <w:noProof/>
             <w:webHidden/>
           </w:rPr>
-          <w:instrText xml:space="preserve"> PAGEREF _Toc244207441 \h </w:instrText>
+          <w:instrText xml:space="preserve"> PAGEREF _Toc244237091 \h </w:instrText>
         </w:r>
         <w:r>
           <w:rPr>
@@ -523,7 +522,7 @@
           <w14:ligatures w14:val="standardContextual"/>
         </w:rPr>
       </w:pPr>
-      <w:hyperlink w:anchor="_Toc244207442" w:history="1">
+      <w:hyperlink w:anchor="_Toc244237092" w:history="1">
         <w:r>
           <w:rPr>
             <w:rStyle w:val="Hyperlink"/>
@@ -550,7 +549,7 @@
             <w:noProof/>
             <w:webHidden/>
           </w:rPr>
-          <w:instrText xml:space="preserve"> PAGEREF _Toc244207442 \h </w:instrText>
+          <w:instrText xml:space="preserve"> PAGEREF _Toc244237092 \h </w:instrText>
         </w:r>
         <w:r>
           <w:rPr>
@@ -596,7 +595,7 @@
           <w14:ligatures w14:val="standardContextual"/>
         </w:rPr>
       </w:pPr>
-      <w:hyperlink w:anchor="_Toc244207443" w:history="1">
+      <w:hyperlink w:anchor="_Toc244237093" w:history="1">
         <w:r>
           <w:rPr>
             <w:rStyle w:val="Hyperlink"/>
@@ -623,7 +622,7 @@
             <w:noProof/>
             <w:webHidden/>
           </w:rPr>
-          <w:instrText xml:space="preserve"> PAGEREF _Toc244207443 \h </w:instrText>
+          <w:instrText xml:space="preserve"> PAGEREF _Toc244237093 \h </w:instrText>
         </w:r>
         <w:r>
           <w:rPr>
@@ -669,7 +668,7 @@
           <w14:ligatures w14:val="standardContextual"/>
         </w:rPr>
       </w:pPr>
-      <w:hyperlink w:anchor="_Toc244207444" w:history="1">
+      <w:hyperlink w:anchor="_Toc244237094" w:history="1">
         <w:r>
           <w:rPr>
             <w:rStyle w:val="Hyperlink"/>
@@ -696,7 +695,7 @@
             <w:noProof/>
             <w:webHidden/>
           </w:rPr>
-          <w:instrText xml:space="preserve"> PAGEREF _Toc244207444 \h </w:instrText>
+          <w:instrText xml:space="preserve"> PAGEREF _Toc244237094 \h </w:instrText>
         </w:r>
         <w:r>
           <w:rPr>
@@ -742,7 +741,7 @@
           <w14:ligatures w14:val="standardContextual"/>
         </w:rPr>
       </w:pPr>
-      <w:hyperlink w:anchor="_Toc244207445" w:history="1">
+      <w:hyperlink w:anchor="_Toc244237095" w:history="1">
         <w:r>
           <w:rPr>
             <w:rStyle w:val="Hyperlink"/>
@@ -769,7 +768,7 @@
             <w:noProof/>
             <w:webHidden/>
           </w:rPr>
-          <w:instrText xml:space="preserve"> PAGEREF _Toc244207445 \h </w:instrText>
+          <w:instrText xml:space="preserve"> PAGEREF _Toc244237095 \h </w:instrText>
         </w:r>
         <w:r>
           <w:rPr>
@@ -815,7 +814,7 @@
           <w14:ligatures w14:val="standardContextual"/>
         </w:rPr>
       </w:pPr>
-      <w:hyperlink w:anchor="_Toc244207446" w:history="1">
+      <w:hyperlink w:anchor="_Toc244237096" w:history="1">
         <w:r>
           <w:rPr>
             <w:rStyle w:val="Hyperlink"/>
@@ -842,7 +841,7 @@
             <w:noProof/>
             <w:webHidden/>
           </w:rPr>
-          <w:instrText xml:space="preserve"> PAGEREF _Toc244207446 \h </w:instrText>
+          <w:instrText xml:space="preserve"> PAGEREF _Toc244237096 \h </w:instrText>
         </w:r>
         <w:r>
           <w:rPr>
@@ -888,7 +887,7 @@
           <w14:ligatures w14:val="standardContextual"/>
         </w:rPr>
       </w:pPr>
-      <w:hyperlink w:anchor="_Toc244207447" w:history="1">
+      <w:hyperlink w:anchor="_Toc244237097" w:history="1">
         <w:r>
           <w:rPr>
             <w:rStyle w:val="Hyperlink"/>
@@ -915,7 +914,7 @@
             <w:noProof/>
             <w:webHidden/>
           </w:rPr>
-          <w:instrText xml:space="preserve"> PAGEREF _Toc244207447 \h </w:instrText>
+          <w:instrText xml:space="preserve"> PAGEREF _Toc244237097 \h </w:instrText>
         </w:r>
         <w:r>
           <w:rPr>
@@ -961,7 +960,7 @@
           <w14:ligatures w14:val="standardContextual"/>
         </w:rPr>
       </w:pPr>
-      <w:hyperlink w:anchor="_Toc244207448" w:history="1">
+      <w:hyperlink w:anchor="_Toc244237098" w:history="1">
         <w:r>
           <w:rPr>
             <w:rStyle w:val="Hyperlink"/>
@@ -988,7 +987,7 @@
             <w:noProof/>
             <w:webHidden/>
           </w:rPr>
-          <w:instrText xml:space="preserve"> PAGEREF _Toc244207448 \h </w:instrText>
+          <w:instrText xml:space="preserve"> PAGEREF _Toc244237098 \h </w:instrText>
         </w:r>
         <w:r>
           <w:rPr>
@@ -1034,7 +1033,7 @@
           <w14:ligatures w14:val="standardContextual"/>
         </w:rPr>
       </w:pPr>
-      <w:hyperlink w:anchor="_Toc244207449" w:history="1">
+      <w:hyperlink w:anchor="_Toc244237099" w:history="1">
         <w:r>
           <w:rPr>
             <w:rStyle w:val="Hyperlink"/>
@@ -1061,7 +1060,7 @@
             <w:noProof/>
             <w:webHidden/>
           </w:rPr>
-          <w:instrText xml:space="preserve"> PAGEREF _Toc244207449 \h </w:instrText>
+          <w:instrText xml:space="preserve"> PAGEREF _Toc244237099 \h </w:instrText>
         </w:r>
         <w:r>
           <w:rPr>
@@ -1107,7 +1106,7 @@
           <w14:ligatures w14:val="standardContextual"/>
         </w:rPr>
       </w:pPr>
-      <w:hyperlink w:anchor="_Toc244207450" w:history="1">
+      <w:hyperlink w:anchor="_Toc244237100" w:history="1">
         <w:r>
           <w:rPr>
             <w:rStyle w:val="Hyperlink"/>
@@ -1134,7 +1133,7 @@
             <w:noProof/>
             <w:webHidden/>
           </w:rPr>
-          <w:instrText xml:space="preserve"> PAGEREF _Toc244207450 \h </w:instrText>
+          <w:instrText xml:space="preserve"> PAGEREF _Toc244237100 \h </w:instrText>
         </w:r>
         <w:r>
           <w:rPr>
@@ -1180,7 +1179,7 @@
           <w14:ligatures w14:val="standardContextual"/>
         </w:rPr>
       </w:pPr>
-      <w:hyperlink w:anchor="_Toc244207451" w:history="1">
+      <w:hyperlink w:anchor="_Toc244237101" w:history="1">
         <w:r>
           <w:rPr>
             <w:rStyle w:val="Hyperlink"/>
@@ -1207,7 +1206,7 @@
             <w:noProof/>
             <w:webHidden/>
           </w:rPr>
-          <w:instrText xml:space="preserve"> PAGEREF _Toc244207451 \h </w:instrText>
+          <w:instrText xml:space="preserve"> PAGEREF _Toc244237101 \h </w:instrText>
         </w:r>
         <w:r>
           <w:rPr>
@@ -1253,7 +1252,7 @@
           <w14:ligatures w14:val="standardContextual"/>
         </w:rPr>
       </w:pPr>
-      <w:hyperlink w:anchor="_Toc244207452" w:history="1">
+      <w:hyperlink w:anchor="_Toc244237102" w:history="1">
         <w:r>
           <w:rPr>
             <w:rStyle w:val="Hyperlink"/>
@@ -1280,7 +1279,7 @@
             <w:noProof/>
             <w:webHidden/>
           </w:rPr>
-          <w:instrText xml:space="preserve"> PAGEREF _Toc244207452 \h </w:instrText>
+          <w:instrText xml:space="preserve"> PAGEREF _Toc244237102 \h </w:instrText>
         </w:r>
         <w:r>
           <w:rPr>
@@ -1326,7 +1325,7 @@
           <w14:ligatures w14:val="standardContextual"/>
         </w:rPr>
       </w:pPr>
-      <w:hyperlink w:anchor="_Toc244207453" w:history="1">
+      <w:hyperlink w:anchor="_Toc244237103" w:history="1">
         <w:r>
           <w:rPr>
             <w:rStyle w:val="Hyperlink"/>
@@ -1353,7 +1352,7 @@
             <w:noProof/>
             <w:webHidden/>
           </w:rPr>
-          <w:instrText xml:space="preserve"> PAGEREF _Toc244207453 \h </w:instrText>
+          <w:instrText xml:space="preserve"> PAGEREF _Toc244237103 \h </w:instrText>
         </w:r>
         <w:r>
           <w:rPr>
@@ -1399,7 +1398,7 @@
           <w14:ligatures w14:val="standardContextual"/>
         </w:rPr>
       </w:pPr>
-      <w:hyperlink w:anchor="_Toc244207454" w:history="1">
+      <w:hyperlink w:anchor="_Toc244237104" w:history="1">
         <w:r>
           <w:rPr>
             <w:rStyle w:val="Hyperlink"/>
@@ -1426,7 +1425,7 @@
             <w:noProof/>
             <w:webHidden/>
           </w:rPr>
-          <w:instrText xml:space="preserve"> PAGEREF _Toc244207454 \h </w:instrText>
+          <w:instrText xml:space="preserve"> PAGEREF _Toc244237104 \h </w:instrText>
         </w:r>
         <w:r>
           <w:rPr>
@@ -1472,7 +1471,7 @@
           <w14:ligatures w14:val="standardContextual"/>
         </w:rPr>
       </w:pPr>
-      <w:hyperlink w:anchor="_Toc244207455" w:history="1">
+      <w:hyperlink w:anchor="_Toc244237105" w:history="1">
         <w:r>
           <w:rPr>
             <w:rStyle w:val="Hyperlink"/>
@@ -1499,7 +1498,7 @@
             <w:noProof/>
             <w:webHidden/>
           </w:rPr>
-          <w:instrText xml:space="preserve"> PAGEREF _Toc244207455 \h </w:instrText>
+          <w:instrText xml:space="preserve"> PAGEREF _Toc244237105 \h </w:instrText>
         </w:r>
         <w:r>
           <w:rPr>
@@ -1545,7 +1544,7 @@
           <w14:ligatures w14:val="standardContextual"/>
         </w:rPr>
       </w:pPr>
-      <w:hyperlink w:anchor="_Toc244207456" w:history="1">
+      <w:hyperlink w:anchor="_Toc244237106" w:history="1">
         <w:r>
           <w:rPr>
             <w:rStyle w:val="Hyperlink"/>
@@ -1572,7 +1571,7 @@
             <w:noProof/>
             <w:webHidden/>
           </w:rPr>
-          <w:instrText xml:space="preserve"> PAGEREF _Toc244207456 \h </w:instrText>
+          <w:instrText xml:space="preserve"> PAGEREF _Toc244237106 \h </w:instrText>
         </w:r>
         <w:r>
           <w:rPr>
@@ -1618,7 +1617,7 @@
           <w14:ligatures w14:val="standardContextual"/>
         </w:rPr>
       </w:pPr>
-      <w:hyperlink w:anchor="_Toc244207457" w:history="1">
+      <w:hyperlink w:anchor="_Toc244237107" w:history="1">
         <w:r>
           <w:rPr>
             <w:rStyle w:val="Hyperlink"/>
@@ -1645,7 +1644,7 @@
             <w:noProof/>
             <w:webHidden/>
           </w:rPr>
-          <w:instrText xml:space="preserve"> PAGEREF _Toc244207457 \h </w:instrText>
+          <w:instrText xml:space="preserve"> PAGEREF _Toc244237107 \h </w:instrText>
         </w:r>
         <w:r>
           <w:rPr>
@@ -1691,7 +1690,7 @@
           <w14:ligatures w14:val="standardContextual"/>
         </w:rPr>
       </w:pPr>
-      <w:hyperlink w:anchor="_Toc244207458" w:history="1">
+      <w:hyperlink w:anchor="_Toc244237108" w:history="1">
         <w:r>
           <w:rPr>
             <w:rStyle w:val="Hyperlink"/>
@@ -1718,7 +1717,7 @@
             <w:noProof/>
             <w:webHidden/>
           </w:rPr>
-          <w:instrText xml:space="preserve"> PAGEREF _Toc244207458 \h </w:instrText>
+          <w:instrText xml:space="preserve"> PAGEREF _Toc244237108 \h </w:instrText>
         </w:r>
         <w:r>
           <w:rPr>
@@ -1764,7 +1763,7 @@
           <w14:ligatures w14:val="standardContextual"/>
         </w:rPr>
       </w:pPr>
-      <w:hyperlink w:anchor="_Toc244207459" w:history="1">
+      <w:hyperlink w:anchor="_Toc244237109" w:history="1">
         <w:r>
           <w:rPr>
             <w:rStyle w:val="Hyperlink"/>
@@ -1791,7 +1790,7 @@
             <w:noProof/>
             <w:webHidden/>
           </w:rPr>
-          <w:instrText xml:space="preserve"> PAGEREF _Toc244207459 \h </w:instrText>
+          <w:instrText xml:space="preserve"> PAGEREF _Toc244237109 \h </w:instrText>
         </w:r>
         <w:r>
           <w:rPr>
@@ -1837,7 +1836,7 @@
           <w14:ligatures w14:val="standardContextual"/>
         </w:rPr>
       </w:pPr>
-      <w:hyperlink w:anchor="_Toc244207460" w:history="1">
+      <w:hyperlink w:anchor="_Toc244237110" w:history="1">
         <w:r>
           <w:rPr>
             <w:rStyle w:val="Hyperlink"/>
@@ -1864,7 +1863,7 @@
             <w:noProof/>
             <w:webHidden/>
           </w:rPr>
-          <w:instrText xml:space="preserve"> PAGEREF _Toc244207460 \h </w:instrText>
+          <w:instrText xml:space="preserve"> PAGEREF _Toc244237110 \h </w:instrText>
         </w:r>
         <w:r>
           <w:rPr>
@@ -1910,7 +1909,7 @@
           <w14:ligatures w14:val="standardContextual"/>
         </w:rPr>
       </w:pPr>
-      <w:hyperlink w:anchor="_Toc244207461" w:history="1">
+      <w:hyperlink w:anchor="_Toc244237111" w:history="1">
         <w:r>
           <w:rPr>
             <w:rStyle w:val="Hyperlink"/>
@@ -1937,7 +1936,7 @@
             <w:noProof/>
             <w:webHidden/>
           </w:rPr>
-          <w:instrText xml:space="preserve"> PAGEREF _Toc244207461 \h </w:instrText>
+          <w:instrText xml:space="preserve"> PAGEREF _Toc244237111 \h </w:instrText>
         </w:r>
         <w:r>
           <w:rPr>
@@ -1983,7 +1982,7 @@
           <w14:ligatures w14:val="standardContextual"/>
         </w:rPr>
       </w:pPr>
-      <w:hyperlink w:anchor="_Toc244207462" w:history="1">
+      <w:hyperlink w:anchor="_Toc244237112" w:history="1">
         <w:r>
           <w:rPr>
             <w:rStyle w:val="Hyperlink"/>
@@ -2010,7 +2009,7 @@
             <w:noProof/>
             <w:webHidden/>
           </w:rPr>
-          <w:instrText xml:space="preserve"> PAGEREF _Toc244207462 \h </w:instrText>
+          <w:instrText xml:space="preserve"> PAGEREF _Toc244237112 \h </w:instrText>
         </w:r>
         <w:r>
           <w:rPr>
@@ -2056,7 +2055,7 @@
           <w14:ligatures w14:val="standardContextual"/>
         </w:rPr>
       </w:pPr>
-      <w:hyperlink w:anchor="_Toc244207463" w:history="1">
+      <w:hyperlink w:anchor="_Toc244237113" w:history="1">
         <w:r>
           <w:rPr>
             <w:rStyle w:val="Hyperlink"/>
@@ -2083,7 +2082,7 @@
             <w:noProof/>
             <w:webHidden/>
           </w:rPr>
-          <w:instrText xml:space="preserve"> PAGEREF _Toc244207463 \h </w:instrText>
+          <w:instrText xml:space="preserve"> PAGEREF _Toc244237113 \h </w:instrText>
         </w:r>
         <w:r>
           <w:rPr>
@@ -2129,7 +2128,7 @@
           <w14:ligatures w14:val="standardContextual"/>
         </w:rPr>
       </w:pPr>
-      <w:hyperlink w:anchor="_Toc244207464" w:history="1">
+      <w:hyperlink w:anchor="_Toc244237114" w:history="1">
         <w:r>
           <w:rPr>
             <w:rStyle w:val="Hyperlink"/>
@@ -2156,7 +2155,7 @@
             <w:noProof/>
             <w:webHidden/>
           </w:rPr>
-          <w:instrText xml:space="preserve"> PAGEREF _Toc244207464 \h </w:instrText>
+          <w:instrText xml:space="preserve"> PAGEREF _Toc244237114 \h </w:instrText>
         </w:r>
         <w:r>
           <w:rPr>
@@ -2202,7 +2201,7 @@
           <w14:ligatures w14:val="standardContextual"/>
         </w:rPr>
       </w:pPr>
-      <w:hyperlink w:anchor="_Toc244207465" w:history="1">
+      <w:hyperlink w:anchor="_Toc244237115" w:history="1">
         <w:r>
           <w:rPr>
             <w:rStyle w:val="Hyperlink"/>
@@ -2229,7 +2228,7 @@
             <w:noProof/>
             <w:webHidden/>
           </w:rPr>
-          <w:instrText xml:space="preserve"> PAGEREF _Toc244207465 \h </w:instrText>
+          <w:instrText xml:space="preserve"> PAGEREF _Toc244237115 \h </w:instrText>
         </w:r>
         <w:r>
           <w:rPr>
@@ -2275,7 +2274,7 @@
           <w14:ligatures w14:val="standardContextual"/>
         </w:rPr>
       </w:pPr>
-      <w:hyperlink w:anchor="_Toc244207466" w:history="1">
+      <w:hyperlink w:anchor="_Toc244237116" w:history="1">
         <w:r>
           <w:rPr>
             <w:rStyle w:val="Hyperlink"/>
@@ -2302,7 +2301,7 @@
             <w:noProof/>
             <w:webHidden/>
           </w:rPr>
-          <w:instrText xml:space="preserve"> PAGEREF _Toc244207466 \h </w:instrText>
+          <w:instrText xml:space="preserve"> PAGEREF _Toc244237116 \h </w:instrText>
         </w:r>
         <w:r>
           <w:rPr>
@@ -2348,7 +2347,7 @@
           <w14:ligatures w14:val="standardContextual"/>
         </w:rPr>
       </w:pPr>
-      <w:hyperlink w:anchor="_Toc244207467" w:history="1">
+      <w:hyperlink w:anchor="_Toc244237117" w:history="1">
         <w:r>
           <w:rPr>
             <w:rStyle w:val="Hyperlink"/>
@@ -2375,7 +2374,7 @@
             <w:noProof/>
             <w:webHidden/>
           </w:rPr>
-          <w:instrText xml:space="preserve"> PAGEREF _Toc244207467 \h </w:instrText>
+          <w:instrText xml:space="preserve"> PAGEREF _Toc244237117 \h </w:instrText>
         </w:r>
         <w:r>
           <w:rPr>
@@ -2421,7 +2420,7 @@
           <w14:ligatures w14:val="standardContextual"/>
         </w:rPr>
       </w:pPr>
-      <w:hyperlink w:anchor="_Toc244207468" w:history="1">
+      <w:hyperlink w:anchor="_Toc244237118" w:history="1">
         <w:r>
           <w:rPr>
             <w:rStyle w:val="Hyperlink"/>
@@ -2448,7 +2447,7 @@
             <w:noProof/>
             <w:webHidden/>
           </w:rPr>
-          <w:instrText xml:space="preserve"> PAGEREF _Toc244207468 \h </w:instrText>
+          <w:instrText xml:space="preserve"> PAGEREF _Toc244237118 \h </w:instrText>
         </w:r>
         <w:r>
           <w:rPr>
@@ -2494,7 +2493,7 @@
           <w14:ligatures w14:val="standardContextual"/>
         </w:rPr>
       </w:pPr>
-      <w:hyperlink w:anchor="_Toc244207469" w:history="1">
+      <w:hyperlink w:anchor="_Toc244237119" w:history="1">
         <w:r>
           <w:rPr>
             <w:rStyle w:val="Hyperlink"/>
@@ -2521,7 +2520,7 @@
             <w:noProof/>
             <w:webHidden/>
           </w:rPr>
-          <w:instrText xml:space="preserve"> PAGEREF _Toc244207469 \h </w:instrText>
+          <w:instrText xml:space="preserve"> PAGEREF _Toc244237119 \h </w:instrText>
         </w:r>
         <w:r>
           <w:rPr>
@@ -2567,7 +2566,7 @@
           <w14:ligatures w14:val="standardContextual"/>
         </w:rPr>
       </w:pPr>
-      <w:hyperlink w:anchor="_Toc244207470" w:history="1">
+      <w:hyperlink w:anchor="_Toc244237120" w:history="1">
         <w:r>
           <w:rPr>
             <w:rStyle w:val="Hyperlink"/>
@@ -2594,7 +2593,7 @@
             <w:noProof/>
             <w:webHidden/>
           </w:rPr>
-          <w:instrText xml:space="preserve"> PAGEREF _Toc244207470 \h </w:instrText>
+          <w:instrText xml:space="preserve"> PAGEREF _Toc244237120 \h </w:instrText>
         </w:r>
         <w:r>
           <w:rPr>
@@ -2640,7 +2639,7 @@
           <w14:ligatures w14:val="standardContextual"/>
         </w:rPr>
       </w:pPr>
-      <w:hyperlink w:anchor="_Toc244207471" w:history="1">
+      <w:hyperlink w:anchor="_Toc244237121" w:history="1">
         <w:r>
           <w:rPr>
             <w:rStyle w:val="Hyperlink"/>
@@ -2667,7 +2666,7 @@
             <w:noProof/>
             <w:webHidden/>
           </w:rPr>
-          <w:instrText xml:space="preserve"> PAGEREF _Toc244207471 \h </w:instrText>
+          <w:instrText xml:space="preserve"> PAGEREF _Toc244237121 \h </w:instrText>
         </w:r>
         <w:r>
           <w:rPr>
@@ -2713,7 +2712,7 @@
           <w14:ligatures w14:val="standardContextual"/>
         </w:rPr>
       </w:pPr>
-      <w:hyperlink w:anchor="_Toc244207472" w:history="1">
+      <w:hyperlink w:anchor="_Toc244237122" w:history="1">
         <w:r>
           <w:rPr>
             <w:rStyle w:val="Hyperlink"/>
@@ -2740,7 +2739,7 @@
             <w:noProof/>
             <w:webHidden/>
           </w:rPr>
-          <w:instrText xml:space="preserve"> PAGEREF _Toc244207472 \h </w:instrText>
+          <w:instrText xml:space="preserve"> PAGEREF _Toc244237122 \h </w:instrText>
         </w:r>
         <w:r>
           <w:rPr>
@@ -2786,7 +2785,7 @@
           <w14:ligatures w14:val="standardContextual"/>
         </w:rPr>
       </w:pPr>
-      <w:hyperlink w:anchor="_Toc244207473" w:history="1">
+      <w:hyperlink w:anchor="_Toc244237123" w:history="1">
         <w:r>
           <w:rPr>
             <w:rStyle w:val="Hyperlink"/>
@@ -2813,7 +2812,7 @@
             <w:noProof/>
             <w:webHidden/>
           </w:rPr>
-          <w:instrText xml:space="preserve"> PAGEREF _Toc244207473 \h </w:instrText>
+          <w:instrText xml:space="preserve"> PAGEREF _Toc244237123 \h </w:instrText>
         </w:r>
         <w:r>
           <w:rPr>
@@ -2859,7 +2858,7 @@
           <w14:ligatures w14:val="standardContextual"/>
         </w:rPr>
       </w:pPr>
-      <w:hyperlink w:anchor="_Toc244207474" w:history="1">
+      <w:hyperlink w:anchor="_Toc244237124" w:history="1">
         <w:r>
           <w:rPr>
             <w:rStyle w:val="Hyperlink"/>
@@ -2886,7 +2885,7 @@
             <w:noProof/>
             <w:webHidden/>
           </w:rPr>
-          <w:instrText xml:space="preserve"> PAGEREF _Toc244207474 \h </w:instrText>
+          <w:instrText xml:space="preserve"> PAGEREF _Toc244237124 \h </w:instrText>
         </w:r>
         <w:r>
           <w:rPr>
@@ -2932,7 +2931,7 @@
           <w14:ligatures w14:val="standardContextual"/>
         </w:rPr>
       </w:pPr>
-      <w:hyperlink w:anchor="_Toc244207475" w:history="1">
+      <w:hyperlink w:anchor="_Toc244237125" w:history="1">
         <w:r>
           <w:rPr>
             <w:rStyle w:val="Hyperlink"/>
@@ -2959,7 +2958,7 @@
             <w:noProof/>
             <w:webHidden/>
           </w:rPr>
-          <w:instrText xml:space="preserve"> PAGEREF _Toc244207475 \h </w:instrText>
+          <w:instrText xml:space="preserve"> PAGEREF _Toc244237125 \h </w:instrText>
         </w:r>
         <w:r>
           <w:rPr>
@@ -3005,7 +3004,7 @@
           <w14:ligatures w14:val="standardContextual"/>
         </w:rPr>
       </w:pPr>
-      <w:hyperlink w:anchor="_Toc244207476" w:history="1">
+      <w:hyperlink w:anchor="_Toc244237126" w:history="1">
         <w:r>
           <w:rPr>
             <w:rStyle w:val="Hyperlink"/>
@@ -3032,7 +3031,7 @@
             <w:noProof/>
             <w:webHidden/>
           </w:rPr>
-          <w:instrText xml:space="preserve"> PAGEREF _Toc244207476 \h </w:instrText>
+          <w:instrText xml:space="preserve"> PAGEREF _Toc244237126 \h </w:instrText>
         </w:r>
         <w:r>
           <w:rPr>
@@ -3078,7 +3077,7 @@
           <w14:ligatures w14:val="standardContextual"/>
         </w:rPr>
       </w:pPr>
-      <w:hyperlink w:anchor="_Toc244207477" w:history="1">
+      <w:hyperlink w:anchor="_Toc244237127" w:history="1">
         <w:r>
           <w:rPr>
             <w:rStyle w:val="Hyperlink"/>
@@ -3105,7 +3104,7 @@
             <w:noProof/>
             <w:webHidden/>
           </w:rPr>
-          <w:instrText xml:space="preserve"> PAGEREF _Toc244207477 \h </w:instrText>
+          <w:instrText xml:space="preserve"> PAGEREF _Toc244237127 \h </w:instrText>
         </w:r>
         <w:r>
           <w:rPr>
@@ -3151,7 +3150,7 @@
           <w14:ligatures w14:val="standardContextual"/>
         </w:rPr>
       </w:pPr>
-      <w:hyperlink w:anchor="_Toc244207478" w:history="1">
+      <w:hyperlink w:anchor="_Toc244237128" w:history="1">
         <w:r>
           <w:rPr>
             <w:rStyle w:val="Hyperlink"/>
@@ -3178,7 +3177,7 @@
             <w:noProof/>
             <w:webHidden/>
           </w:rPr>
-          <w:instrText xml:space="preserve"> PAGEREF _Toc244207478 \h </w:instrText>
+          <w:instrText xml:space="preserve"> PAGEREF _Toc244237128 \h </w:instrText>
         </w:r>
         <w:r>
           <w:rPr>
@@ -3224,7 +3223,7 @@
           <w14:ligatures w14:val="standardContextual"/>
         </w:rPr>
       </w:pPr>
-      <w:hyperlink w:anchor="_Toc244207479" w:history="1">
+      <w:hyperlink w:anchor="_Toc244237129" w:history="1">
         <w:r>
           <w:rPr>
             <w:rStyle w:val="Hyperlink"/>
@@ -3251,7 +3250,7 @@
             <w:noProof/>
             <w:webHidden/>
           </w:rPr>
-          <w:instrText xml:space="preserve"> PAGEREF _Toc244207479 \h </w:instrText>
+          <w:instrText xml:space="preserve"> PAGEREF _Toc244237129 \h </w:instrText>
         </w:r>
         <w:r>
           <w:rPr>
@@ -3297,7 +3296,7 @@
           <w14:ligatures w14:val="standardContextual"/>
         </w:rPr>
       </w:pPr>
-      <w:hyperlink w:anchor="_Toc244207480" w:history="1">
+      <w:hyperlink w:anchor="_Toc244237130" w:history="1">
         <w:r>
           <w:rPr>
             <w:rStyle w:val="Hyperlink"/>
@@ -3324,7 +3323,7 @@
             <w:noProof/>
             <w:webHidden/>
           </w:rPr>
-          <w:instrText xml:space="preserve"> PAGEREF _Toc244207480 \h </w:instrText>
+          <w:instrText xml:space="preserve"> PAGEREF _Toc244237130 \h </w:instrText>
         </w:r>
         <w:r>
           <w:rPr>
@@ -3370,7 +3369,7 @@
           <w14:ligatures w14:val="standardContextual"/>
         </w:rPr>
       </w:pPr>
-      <w:hyperlink w:anchor="_Toc244207481" w:history="1">
+      <w:hyperlink w:anchor="_Toc244237131" w:history="1">
         <w:r>
           <w:rPr>
             <w:rStyle w:val="Hyperlink"/>
@@ -3397,7 +3396,7 @@
             <w:noProof/>
             <w:webHidden/>
           </w:rPr>
-          <w:instrText xml:space="preserve"> PAGEREF _Toc244207481 \h </w:instrText>
+          <w:instrText xml:space="preserve"> PAGEREF _Toc244237131 \h </w:instrText>
         </w:r>
         <w:r>
           <w:rPr>
@@ -3443,7 +3442,7 @@
           <w14:ligatures w14:val="standardContextual"/>
         </w:rPr>
       </w:pPr>
-      <w:hyperlink w:anchor="_Toc244207482" w:history="1">
+      <w:hyperlink w:anchor="_Toc244237132" w:history="1">
         <w:r>
           <w:rPr>
             <w:rStyle w:val="Hyperlink"/>
@@ -3470,7 +3469,7 @@
             <w:noProof/>
             <w:webHidden/>
           </w:rPr>
-          <w:instrText xml:space="preserve"> PAGEREF _Toc244207482 \h </w:instrText>
+          <w:instrText xml:space="preserve"> PAGEREF _Toc244237132 \h </w:instrText>
         </w:r>
         <w:r>
           <w:rPr>
@@ -3516,7 +3515,7 @@
           <w14:ligatures w14:val="standardContextual"/>
         </w:rPr>
       </w:pPr>
-      <w:hyperlink w:anchor="_Toc244207483" w:history="1">
+      <w:hyperlink w:anchor="_Toc244237133" w:history="1">
         <w:r>
           <w:rPr>
             <w:rStyle w:val="Hyperlink"/>
@@ -3543,7 +3542,7 @@
             <w:noProof/>
             <w:webHidden/>
           </w:rPr>
-          <w:instrText xml:space="preserve"> PAGEREF _Toc244207483 \h </w:instrText>
+          <w:instrText xml:space="preserve"> PAGEREF _Toc244237133 \h </w:instrText>
         </w:r>
         <w:r>
           <w:rPr>
@@ -3589,7 +3588,7 @@
           <w14:ligatures w14:val="standardContextual"/>
         </w:rPr>
       </w:pPr>
-      <w:hyperlink w:anchor="_Toc244207484" w:history="1">
+      <w:hyperlink w:anchor="_Toc244237134" w:history="1">
         <w:r>
           <w:rPr>
             <w:rStyle w:val="Hyperlink"/>
@@ -3616,7 +3615,7 @@
             <w:noProof/>
             <w:webHidden/>
           </w:rPr>
-          <w:instrText xml:space="preserve"> PAGEREF _Toc244207484 \h </w:instrText>
+          <w:instrText xml:space="preserve"> PAGEREF _Toc244237134 \h </w:instrText>
         </w:r>
         <w:r>
           <w:rPr>
@@ -3662,7 +3661,7 @@
           <w14:ligatures w14:val="standardContextual"/>
         </w:rPr>
       </w:pPr>
-      <w:hyperlink w:anchor="_Toc244207485" w:history="1">
+      <w:hyperlink w:anchor="_Toc244237135" w:history="1">
         <w:r>
           <w:rPr>
             <w:rStyle w:val="Hyperlink"/>
@@ -3689,7 +3688,7 @@
             <w:noProof/>
             <w:webHidden/>
           </w:rPr>
-          <w:instrText xml:space="preserve"> PAGEREF _Toc244207485 \h </w:instrText>
+          <w:instrText xml:space="preserve"> PAGEREF _Toc244237135 \h </w:instrText>
         </w:r>
         <w:r>
           <w:rPr>
@@ -3735,7 +3734,7 @@
           <w14:ligatures w14:val="standardContextual"/>
         </w:rPr>
       </w:pPr>
-      <w:hyperlink w:anchor="_Toc244207486" w:history="1">
+      <w:hyperlink w:anchor="_Toc244237136" w:history="1">
         <w:r>
           <w:rPr>
             <w:rStyle w:val="Hyperlink"/>
@@ -3762,7 +3761,7 @@
             <w:noProof/>
             <w:webHidden/>
           </w:rPr>
-          <w:instrText xml:space="preserve"> PAGEREF _Toc244207486 \h </w:instrText>
+          <w:instrText xml:space="preserve"> PAGEREF _Toc244237136 \h </w:instrText>
         </w:r>
         <w:r>
           <w:rPr>
@@ -3801,6 +3800,7 @@
     <w:p>
       <w:pPr>
         <w:sectPr>
+          <w:headerReference w:type="default" r:id="rId8"/>
           <w:pgSz w:w="11906" w:h="16838"/>
           <w:pgMar w:top="1417" w:right="1134" w:bottom="1417" w:left="1701" w:header="720" w:footer="720" w:gutter="0"/>
           <w:cols w:space="720"/>
@@ -3812,9 +3812,8 @@
       <w:pPr>
         <w:pStyle w:val="Heading1"/>
       </w:pPr>
-      <w:bookmarkStart w:id="0" w:name="_Toc244207437"/>
-      <w:r>
-        <w:lastRenderedPageBreak/>
+      <w:bookmarkStart w:id="0" w:name="_Toc244237087"/>
+      <w:r>
         <w:t>1. Gi</w:t>
       </w:r>
       <w:r>
@@ -3835,7 +3834,7 @@
       <w:pPr>
         <w:pStyle w:val="Heading2"/>
       </w:pPr>
-      <w:bookmarkStart w:id="1" w:name="_Toc244207438"/>
+      <w:bookmarkStart w:id="1" w:name="_Toc244237088"/>
       <w:r>
         <w:t>1.1. M</w:t>
       </w:r>
@@ -3977,7 +3976,7 @@
       <w:pPr>
         <w:pStyle w:val="Heading2"/>
       </w:pPr>
-      <w:bookmarkStart w:id="2" w:name="_Toc244207439"/>
+      <w:bookmarkStart w:id="2" w:name="_Toc244237089"/>
       <w:r>
         <w:t>1.2. Ph</w:t>
       </w:r>
@@ -4354,7 +4353,7 @@
       <w:pPr>
         <w:pStyle w:val="Heading2"/>
       </w:pPr>
-      <w:bookmarkStart w:id="3" w:name="_Toc244207440"/>
+      <w:bookmarkStart w:id="3" w:name="_Toc244237090"/>
       <w:r>
         <w:t>1.3. Thu</w:t>
       </w:r>
@@ -4438,7 +4437,6 @@
               <w:rPr>
                 <w:sz w:val="22"/>
               </w:rPr>
-              <w:lastRenderedPageBreak/>
               <w:t>Món (Product)</w:t>
             </w:r>
           </w:p>
@@ -4862,7 +4860,7 @@
       <w:pPr>
         <w:pStyle w:val="Heading2"/>
       </w:pPr>
-      <w:bookmarkStart w:id="4" w:name="_Toc244207441"/>
+      <w:bookmarkStart w:id="4" w:name="_Toc244237091"/>
       <w:r>
         <w:t>1.4. Tài li</w:t>
       </w:r>
@@ -4935,7 +4933,7 @@
       <w:pPr>
         <w:pStyle w:val="Heading1"/>
       </w:pPr>
-      <w:bookmarkStart w:id="5" w:name="_Toc244207442"/>
+      <w:bookmarkStart w:id="5" w:name="_Toc244237092"/>
       <w:r>
         <w:t>2. Mô t</w:t>
       </w:r>
@@ -4969,7 +4967,7 @@
       <w:pPr>
         <w:pStyle w:val="Heading2"/>
       </w:pPr>
-      <w:bookmarkStart w:id="6" w:name="_Toc244207443"/>
+      <w:bookmarkStart w:id="6" w:name="_Toc244237093"/>
       <w:r>
         <w:t>2.1. B</w:t>
       </w:r>
@@ -5019,7 +5017,7 @@
       <w:pPr>
         <w:pStyle w:val="Heading2"/>
       </w:pPr>
-      <w:bookmarkStart w:id="7" w:name="_Toc244207444"/>
+      <w:bookmarkStart w:id="7" w:name="_Toc244237094"/>
       <w:r>
         <w:t>2.2. M</w:t>
       </w:r>
@@ -5269,14 +5267,7 @@
               <w:rPr>
                 <w:sz w:val="22"/>
               </w:rPr>
-              <w:t xml:space="preserve">Không có đơn nào làm tồn kho âm, kể cả khi nhiều </w:t>
-            </w:r>
-            <w:r>
-              <w:rPr>
-                <w:sz w:val="22"/>
-              </w:rPr>
-              <w:lastRenderedPageBreak/>
-              <w:t>người đặt cùng lúc</w:t>
+              <w:t>Không có đơn nào làm tồn kho âm, kể cả khi nhiều người đặt cùng lúc</w:t>
             </w:r>
           </w:p>
         </w:tc>
@@ -5297,7 +5288,6 @@
               <w:rPr>
                 <w:sz w:val="22"/>
               </w:rPr>
-              <w:lastRenderedPageBreak/>
               <w:t>G4</w:t>
             </w:r>
           </w:p>
@@ -5345,7 +5335,7 @@
       <w:pPr>
         <w:pStyle w:val="Heading2"/>
       </w:pPr>
-      <w:bookmarkStart w:id="8" w:name="_Toc244207445"/>
+      <w:bookmarkStart w:id="8" w:name="_Toc244237095"/>
       <w:r>
         <w:t>2.3. Ki</w:t>
       </w:r>
@@ -5849,7 +5839,7 @@
       <w:pPr>
         <w:pStyle w:val="Heading2"/>
       </w:pPr>
-      <w:bookmarkStart w:id="9" w:name="_Toc244207446"/>
+      <w:bookmarkStart w:id="9" w:name="_Toc244237096"/>
       <w:r>
         <w:t>2.4. Phân vai gi</w:t>
       </w:r>
@@ -6291,7 +6281,6 @@
               <w:rPr>
                 <w:sz w:val="22"/>
               </w:rPr>
-              <w:lastRenderedPageBreak/>
               <w:t>Đánh dấu món hết hàng, cập nhật tồn kho</w:t>
             </w:r>
           </w:p>
@@ -6439,7 +6428,7 @@
       <w:pPr>
         <w:pStyle w:val="Heading2"/>
       </w:pPr>
-      <w:bookmarkStart w:id="10" w:name="_Toc244207447"/>
+      <w:bookmarkStart w:id="10" w:name="_Toc244237097"/>
       <w:r>
         <w:t>2.5. Gi</w:t>
       </w:r>
@@ -6799,9 +6788,8 @@
         <w:pStyle w:val="Heading1"/>
         <w:pageBreakBefore/>
       </w:pPr>
-      <w:bookmarkStart w:id="11" w:name="_Toc244207448"/>
-      <w:r>
-        <w:lastRenderedPageBreak/>
+      <w:bookmarkStart w:id="11" w:name="_Toc244237098"/>
+      <w:r>
         <w:t>3. Actor và hành vi</w:t>
       </w:r>
       <w:bookmarkEnd w:id="11"/>
@@ -6810,7 +6798,7 @@
       <w:pPr>
         <w:pStyle w:val="Heading2"/>
       </w:pPr>
-      <w:bookmarkStart w:id="12" w:name="_Toc244207449"/>
+      <w:bookmarkStart w:id="12" w:name="_Toc244237099"/>
       <w:r>
         <w:t>3.1. Danh sách actor</w:t>
       </w:r>
@@ -7639,7 +7627,7 @@
       <w:pPr>
         <w:pStyle w:val="Heading2"/>
       </w:pPr>
-      <w:bookmarkStart w:id="13" w:name="_Toc244207450"/>
+      <w:bookmarkStart w:id="13" w:name="_Toc244237100"/>
       <w:r>
         <w:t>3.2. Hành vi c</w:t>
       </w:r>
@@ -9241,7 +9229,6 @@
               <w:rPr>
                 <w:sz w:val="22"/>
               </w:rPr>
-              <w:lastRenderedPageBreak/>
               <w:t>Quản lý món</w:t>
             </w:r>
           </w:p>
@@ -10044,7 +10031,7 @@
       <w:pPr>
         <w:pStyle w:val="Heading2"/>
       </w:pPr>
-      <w:bookmarkStart w:id="14" w:name="_Toc244207451"/>
+      <w:bookmarkStart w:id="14" w:name="_Toc244237101"/>
       <w:r>
         <w:t>3.3. Sơ đ</w:t>
       </w:r>
@@ -10727,9 +10714,8 @@
         <w:pStyle w:val="Heading1"/>
         <w:pageBreakBefore/>
       </w:pPr>
-      <w:bookmarkStart w:id="15" w:name="_Toc244207452"/>
-      <w:r>
-        <w:lastRenderedPageBreak/>
+      <w:bookmarkStart w:id="15" w:name="_Toc244237102"/>
+      <w:r>
         <w:t>4. User stories</w:t>
       </w:r>
       <w:bookmarkEnd w:id="15"/>
@@ -10738,7 +10724,7 @@
       <w:pPr>
         <w:pStyle w:val="Heading2"/>
       </w:pPr>
-      <w:bookmarkStart w:id="16" w:name="_Toc244207453"/>
+      <w:bookmarkStart w:id="16" w:name="_Toc244237103"/>
       <w:r>
         <w:t>4.1. Quy ư</w:t>
       </w:r>
@@ -10920,7 +10906,7 @@
       <w:pPr>
         <w:pStyle w:val="Heading2"/>
       </w:pPr>
-      <w:bookmarkStart w:id="17" w:name="_Toc244207454"/>
+      <w:bookmarkStart w:id="17" w:name="_Toc244237104"/>
       <w:r>
         <w:t>4.2. Khách vãng lai (A1)</w:t>
       </w:r>
@@ -11641,7 +11627,7 @@
       <w:pPr>
         <w:pStyle w:val="Heading2"/>
       </w:pPr>
-      <w:bookmarkStart w:id="18" w:name="_Toc244207455"/>
+      <w:bookmarkStart w:id="18" w:name="_Toc244237105"/>
       <w:r>
         <w:t>4.3. Khách hàng (A2)</w:t>
       </w:r>
@@ -11773,7 +11759,6 @@
               <w:rPr>
                 <w:sz w:val="22"/>
               </w:rPr>
-              <w:lastRenderedPageBreak/>
               <w:t>US-C01</w:t>
             </w:r>
           </w:p>
@@ -13298,9 +13283,8 @@
       <w:pPr>
         <w:pStyle w:val="Heading2"/>
       </w:pPr>
-      <w:bookmarkStart w:id="19" w:name="_Toc244207456"/>
-      <w:r>
-        <w:lastRenderedPageBreak/>
+      <w:bookmarkStart w:id="19" w:name="_Toc244237106"/>
+      <w:r>
         <w:t>4.4. Nhân viên căn tin (A3)</w:t>
       </w:r>
       <w:bookmarkEnd w:id="19"/>
@@ -14105,7 +14089,7 @@
       <w:pPr>
         <w:pStyle w:val="Heading2"/>
       </w:pPr>
-      <w:bookmarkStart w:id="20" w:name="_Toc244207457"/>
+      <w:bookmarkStart w:id="20" w:name="_Toc244237107"/>
       <w:r>
         <w:t>4.5. Qu</w:t>
       </w:r>
@@ -14832,7 +14816,7 @@
       <w:pPr>
         <w:pStyle w:val="Heading2"/>
       </w:pPr>
-      <w:bookmarkStart w:id="21" w:name="_Toc244207458"/>
+      <w:bookmarkStart w:id="21" w:name="_Toc244237108"/>
       <w:r>
         <w:t>4.6. H</w:t>
       </w:r>
@@ -15395,7 +15379,7 @@
       <w:pPr>
         <w:pStyle w:val="Heading2"/>
       </w:pPr>
-      <w:bookmarkStart w:id="22" w:name="_Toc244207459"/>
+      <w:bookmarkStart w:id="22" w:name="_Toc244237109"/>
       <w:r>
         <w:t>4.7. Tiêu chí ch</w:t>
       </w:r>
@@ -15600,7 +15584,6 @@
         <w:ind w:left="454" w:hanging="340"/>
       </w:pPr>
       <w:r>
-        <w:lastRenderedPageBreak/>
         <w:t>•</w:t>
       </w:r>
       <w:r>
@@ -15939,7 +15922,6 @@
         <w:rPr>
           <w:b/>
         </w:rPr>
-        <w:lastRenderedPageBreak/>
         <w:t>US-C08 - Hủy đơn</w:t>
       </w:r>
     </w:p>
@@ -16382,7 +16364,6 @@
         <w:rPr>
           <w:b/>
         </w:rPr>
-        <w:lastRenderedPageBreak/>
         <w:t>US-SYS03 - Chặn đặt quá tồn kho</w:t>
       </w:r>
     </w:p>
@@ -16407,9 +16388,8 @@
         <w:pStyle w:val="Heading1"/>
         <w:pageBreakBefore/>
       </w:pPr>
-      <w:bookmarkStart w:id="23" w:name="_Toc244207460"/>
-      <w:r>
-        <w:lastRenderedPageBreak/>
+      <w:bookmarkStart w:id="23" w:name="_Toc244237110"/>
+      <w:r>
         <w:t>5. Phân tích module và ch</w:t>
       </w:r>
       <w:r>
@@ -16424,7 +16404,7 @@
       <w:pPr>
         <w:pStyle w:val="Heading2"/>
       </w:pPr>
-      <w:bookmarkStart w:id="24" w:name="_Toc244207461"/>
+      <w:bookmarkStart w:id="24" w:name="_Toc244237111"/>
       <w:r>
         <w:t>5.1. T</w:t>
       </w:r>
@@ -17792,7 +17772,7 @@
       <w:pPr>
         <w:pStyle w:val="Heading2"/>
       </w:pPr>
-      <w:bookmarkStart w:id="25" w:name="_Toc244207462"/>
+      <w:bookmarkStart w:id="25" w:name="_Toc244237112"/>
       <w:r>
         <w:t>5.2. M01 - Xác th</w:t>
       </w:r>
@@ -17911,7 +17891,6 @@
         <w:ind w:left="907" w:hanging="340"/>
       </w:pPr>
       <w:r>
-        <w:lastRenderedPageBreak/>
         <w:t>1.</w:t>
       </w:r>
       <w:r>
@@ -18592,7 +18571,6 @@
         <w:pStyle w:val="Heading3"/>
       </w:pPr>
       <w:r>
-        <w:lastRenderedPageBreak/>
         <w:t>F01.4. Đăng xu</w:t>
       </w:r>
       <w:r>
@@ -18847,7 +18825,7 @@
       <w:pPr>
         <w:pStyle w:val="Heading2"/>
       </w:pPr>
-      <w:bookmarkStart w:id="26" w:name="_Toc244207463"/>
+      <w:bookmarkStart w:id="26" w:name="_Toc244237113"/>
       <w:r>
         <w:t>5.3. M02 - Th</w:t>
       </w:r>
@@ -19337,7 +19315,6 @@
         <w:ind w:left="454" w:hanging="340"/>
       </w:pPr>
       <w:r>
-        <w:lastRenderedPageBreak/>
         <w:t>•</w:t>
       </w:r>
       <w:r>
@@ -19604,7 +19581,7 @@
       <w:pPr>
         <w:pStyle w:val="Heading2"/>
       </w:pPr>
-      <w:bookmarkStart w:id="27" w:name="_Toc244207464"/>
+      <w:bookmarkStart w:id="27" w:name="_Toc244237114"/>
       <w:r>
         <w:t>5.4. M03 - Gi</w:t>
       </w:r>
@@ -19924,7 +19901,7 @@
       <w:pPr>
         <w:pStyle w:val="Heading2"/>
       </w:pPr>
-      <w:bookmarkStart w:id="28" w:name="_Toc244207465"/>
+      <w:bookmarkStart w:id="28" w:name="_Toc244237115"/>
       <w:r>
         <w:t>5.5. M04 - Đơn hàng</w:t>
       </w:r>
@@ -20051,7 +20028,6 @@
         <w:ind w:left="907" w:hanging="340"/>
       </w:pPr>
       <w:r>
-        <w:lastRenderedPageBreak/>
         <w:t>1.</w:t>
       </w:r>
       <w:r>
@@ -20926,7 +20902,6 @@
         <w:pStyle w:val="Heading3"/>
       </w:pPr>
       <w:r>
-        <w:lastRenderedPageBreak/>
         <w:t>F04.5. Đ</w:t>
       </w:r>
       <w:r>
@@ -21015,7 +20990,7 @@
       <w:pPr>
         <w:pStyle w:val="Heading2"/>
       </w:pPr>
-      <w:bookmarkStart w:id="29" w:name="_Toc244207466"/>
+      <w:bookmarkStart w:id="29" w:name="_Toc244237116"/>
       <w:r>
         <w:t>5.6. M05 - Yêu thích</w:t>
       </w:r>
@@ -21282,7 +21257,7 @@
       <w:pPr>
         <w:pStyle w:val="Heading2"/>
       </w:pPr>
-      <w:bookmarkStart w:id="30" w:name="_Toc244207467"/>
+      <w:bookmarkStart w:id="30" w:name="_Toc244237117"/>
       <w:r>
         <w:t>5.7. M06 - Qu</w:t>
       </w:r>
@@ -21696,7 +21671,6 @@
         <w:ind w:left="454" w:hanging="340"/>
       </w:pPr>
       <w:r>
-        <w:lastRenderedPageBreak/>
         <w:t>•</w:t>
       </w:r>
       <w:r>
@@ -21726,7 +21700,7 @@
       <w:pPr>
         <w:pStyle w:val="Heading2"/>
       </w:pPr>
-      <w:bookmarkStart w:id="31" w:name="_Toc244207468"/>
+      <w:bookmarkStart w:id="31" w:name="_Toc244237118"/>
       <w:r>
         <w:t>5.8. M07 - H</w:t>
       </w:r>
@@ -22436,9 +22410,8 @@
       <w:pPr>
         <w:pStyle w:val="Heading2"/>
       </w:pPr>
-      <w:bookmarkStart w:id="32" w:name="_Toc244207469"/>
-      <w:r>
-        <w:lastRenderedPageBreak/>
+      <w:bookmarkStart w:id="32" w:name="_Toc244237119"/>
+      <w:r>
         <w:t>5.9. M08 - Thông báo th</w:t>
       </w:r>
       <w:r>
@@ -22996,7 +22969,7 @@
       <w:pPr>
         <w:pStyle w:val="Heading2"/>
       </w:pPr>
-      <w:bookmarkStart w:id="33" w:name="_Toc244207470"/>
+      <w:bookmarkStart w:id="33" w:name="_Toc244237120"/>
       <w:r>
         <w:t>5.10. M09 - V</w:t>
       </w:r>
@@ -23224,7 +23197,6 @@
         <w:pStyle w:val="Heading3"/>
       </w:pPr>
       <w:r>
-        <w:lastRenderedPageBreak/>
         <w:t>F09.2. C</w:t>
       </w:r>
       <w:r>
@@ -23584,7 +23556,7 @@
       <w:pPr>
         <w:pStyle w:val="Heading2"/>
       </w:pPr>
-      <w:bookmarkStart w:id="34" w:name="_Toc244207471"/>
+      <w:bookmarkStart w:id="34" w:name="_Toc244237121"/>
       <w:r>
         <w:t>5.11. M10 - Báo cáo</w:t>
       </w:r>
@@ -23924,9 +23896,8 @@
       <w:pPr>
         <w:pStyle w:val="Heading2"/>
       </w:pPr>
-      <w:bookmarkStart w:id="35" w:name="_Toc244207472"/>
-      <w:r>
-        <w:lastRenderedPageBreak/>
+      <w:bookmarkStart w:id="35" w:name="_Toc244237122"/>
+      <w:r>
         <w:t>5.12. M11 - Qu</w:t>
       </w:r>
       <w:r>
@@ -24423,7 +24394,7 @@
       <w:pPr>
         <w:pStyle w:val="Heading2"/>
       </w:pPr>
-      <w:bookmarkStart w:id="36" w:name="_Toc244207473"/>
+      <w:bookmarkStart w:id="36" w:name="_Toc244237123"/>
       <w:r>
         <w:t>5.13. M12 - H</w:t>
       </w:r>
@@ -24920,9 +24891,8 @@
       <w:pPr>
         <w:pStyle w:val="Heading2"/>
       </w:pPr>
-      <w:bookmarkStart w:id="37" w:name="_Toc244207474"/>
-      <w:r>
-        <w:lastRenderedPageBreak/>
+      <w:bookmarkStart w:id="37" w:name="_Toc244237124"/>
+      <w:r>
         <w:t>5.14. Danh sách màn hình</w:t>
       </w:r>
       <w:bookmarkEnd w:id="37"/>
@@ -26447,9 +26417,8 @@
         <w:pStyle w:val="Heading1"/>
         <w:pageBreakBefore/>
       </w:pPr>
-      <w:bookmarkStart w:id="38" w:name="_Toc244207475"/>
-      <w:r>
-        <w:lastRenderedPageBreak/>
+      <w:bookmarkStart w:id="38" w:name="_Toc244237125"/>
+      <w:r>
         <w:t>6. Quy t</w:t>
       </w:r>
       <w:r>
@@ -27583,9 +27552,8 @@
       <w:pPr>
         <w:pStyle w:val="Heading2"/>
       </w:pPr>
-      <w:bookmarkStart w:id="39" w:name="_Toc244207476"/>
-      <w:r>
-        <w:lastRenderedPageBreak/>
+      <w:bookmarkStart w:id="39" w:name="_Toc244237126"/>
+      <w:r>
         <w:t>6.1. Sơ đ</w:t>
       </w:r>
       <w:r>
@@ -28044,9 +28012,8 @@
         <w:pStyle w:val="Heading1"/>
         <w:pageBreakBefore/>
       </w:pPr>
-      <w:bookmarkStart w:id="40" w:name="_Toc244207477"/>
-      <w:r>
-        <w:lastRenderedPageBreak/>
+      <w:bookmarkStart w:id="40" w:name="_Toc244237127"/>
+      <w:r>
         <w:t>7. D</w:t>
       </w:r>
       <w:r>
@@ -28067,7 +28034,7 @@
       <w:pPr>
         <w:pStyle w:val="Heading2"/>
       </w:pPr>
-      <w:bookmarkStart w:id="41" w:name="_Toc244207478"/>
+      <w:bookmarkStart w:id="41" w:name="_Toc244237128"/>
       <w:r>
         <w:t>7.1. Các b</w:t>
       </w:r>
@@ -28925,7 +28892,7 @@
       <w:pPr>
         <w:pStyle w:val="Heading2"/>
       </w:pPr>
-      <w:bookmarkStart w:id="42" w:name="_Toc244207479"/>
+      <w:bookmarkStart w:id="42" w:name="_Toc244237129"/>
       <w:r>
         <w:t>7.2. Quan h</w:t>
       </w:r>
@@ -29073,7 +29040,7 @@
       <w:pPr>
         <w:pStyle w:val="Heading2"/>
       </w:pPr>
-      <w:bookmarkStart w:id="43" w:name="_Toc244207480"/>
+      <w:bookmarkStart w:id="43" w:name="_Toc244237130"/>
       <w:r>
         <w:t>7.3. Script CSDL</w:t>
       </w:r>
@@ -29346,14 +29313,7 @@
               <w:rPr>
                 <w:sz w:val="22"/>
               </w:rPr>
-              <w:t xml:space="preserve">Tồn kho, ràng buộc, chỉ mục, giao dịch, báo </w:t>
-            </w:r>
-            <w:r>
-              <w:rPr>
-                <w:sz w:val="22"/>
-              </w:rPr>
-              <w:lastRenderedPageBreak/>
-              <w:t>cáo</w:t>
+              <w:t>Tồn kho, ràng buộc, chỉ mục, giao dịch, báo cáo</w:t>
             </w:r>
           </w:p>
         </w:tc>
@@ -29369,7 +29329,6 @@
               <w:rPr>
                 <w:sz w:val="22"/>
               </w:rPr>
-              <w:lastRenderedPageBreak/>
               <w:t>7</w:t>
             </w:r>
           </w:p>
@@ -29825,9 +29784,8 @@
         <w:pStyle w:val="Heading1"/>
         <w:pageBreakBefore/>
       </w:pPr>
-      <w:bookmarkStart w:id="44" w:name="_Toc244207481"/>
-      <w:r>
-        <w:lastRenderedPageBreak/>
+      <w:bookmarkStart w:id="44" w:name="_Toc244237131"/>
+      <w:r>
         <w:t>8. Danh m</w:t>
       </w:r>
       <w:r>
@@ -31344,14 +31302,7 @@
               <w:rPr>
                 <w:sz w:val="22"/>
               </w:rPr>
-              <w:t xml:space="preserve">Đổi ảnh </w:t>
-            </w:r>
-            <w:r>
-              <w:rPr>
-                <w:sz w:val="22"/>
-              </w:rPr>
-              <w:lastRenderedPageBreak/>
-              <w:t>đại diện</w:t>
+              <w:t>Đổi ảnh đại diện</w:t>
             </w:r>
           </w:p>
         </w:tc>
@@ -31367,15 +31318,7 @@
               <w:rPr>
                 <w:sz w:val="22"/>
               </w:rPr>
-              <w:lastRenderedPageBreak/>
-              <w:t xml:space="preserve">Đăng </w:t>
-            </w:r>
-            <w:r>
-              <w:rPr>
-                <w:sz w:val="22"/>
-              </w:rPr>
-              <w:lastRenderedPageBreak/>
-              <w:t>nhập</w:t>
+              <w:t>Đăng nhập</w:t>
             </w:r>
           </w:p>
         </w:tc>
@@ -31392,7 +31335,6 @@
                 <w:rFonts w:ascii="Consolas" w:eastAsia="Consolas" w:hAnsi="Consolas"/>
                 <w:sz w:val="18"/>
               </w:rPr>
-              <w:lastRenderedPageBreak/>
               <w:t>sp_User_UpdateAvatar</w:t>
             </w:r>
           </w:p>
@@ -32682,14 +32624,7 @@
               <w:rPr>
                 <w:sz w:val="22"/>
               </w:rPr>
-              <w:t xml:space="preserve"> (mở </w:t>
-            </w:r>
-            <w:r>
-              <w:rPr>
-                <w:sz w:val="22"/>
-              </w:rPr>
-              <w:lastRenderedPageBreak/>
-              <w:t>rộng)</w:t>
+              <w:t xml:space="preserve"> (mở rộng)</w:t>
             </w:r>
           </w:p>
         </w:tc>
@@ -32705,15 +32640,7 @@
               <w:rPr>
                 <w:sz w:val="22"/>
               </w:rPr>
-              <w:lastRenderedPageBreak/>
-              <w:t xml:space="preserve">Server → </w:t>
-            </w:r>
-            <w:r>
-              <w:rPr>
-                <w:sz w:val="22"/>
-              </w:rPr>
-              <w:lastRenderedPageBreak/>
-              <w:t>client</w:t>
+              <w:t>Server → client</w:t>
             </w:r>
           </w:p>
         </w:tc>
@@ -32729,7 +32656,6 @@
               <w:rPr>
                 <w:sz w:val="22"/>
               </w:rPr>
-              <w:lastRenderedPageBreak/>
               <w:t>Tất cả</w:t>
             </w:r>
           </w:p>
@@ -32747,15 +32673,7 @@
                 <w:rFonts w:ascii="Consolas" w:eastAsia="Consolas" w:hAnsi="Consolas"/>
                 <w:sz w:val="18"/>
               </w:rPr>
-              <w:t xml:space="preserve">{ productId, isAvailable, </w:t>
-            </w:r>
-            <w:r>
-              <w:rPr>
-                <w:rFonts w:ascii="Consolas" w:eastAsia="Consolas" w:hAnsi="Consolas"/>
-                <w:sz w:val="18"/>
-              </w:rPr>
-              <w:lastRenderedPageBreak/>
-              <w:t>stock }</w:t>
+              <w:t>{ productId, isAvailable, stock }</w:t>
             </w:r>
           </w:p>
         </w:tc>
@@ -32771,9 +32689,8 @@
         <w:pStyle w:val="Heading1"/>
         <w:pageBreakBefore/>
       </w:pPr>
-      <w:bookmarkStart w:id="45" w:name="_Toc244207482"/>
-      <w:r>
-        <w:lastRenderedPageBreak/>
+      <w:bookmarkStart w:id="45" w:name="_Toc244237132"/>
+      <w:r>
         <w:t>9. Yêu c</w:t>
       </w:r>
       <w:r>
@@ -33730,9 +33647,8 @@
         <w:pStyle w:val="Heading1"/>
         <w:pageBreakBefore/>
       </w:pPr>
-      <w:bookmarkStart w:id="46" w:name="_Toc244207483"/>
-      <w:r>
-        <w:lastRenderedPageBreak/>
+      <w:bookmarkStart w:id="46" w:name="_Toc244237133"/>
+      <w:r>
         <w:t>10. Truy v</w:t>
       </w:r>
       <w:r>
@@ -33753,7 +33669,7 @@
       <w:pPr>
         <w:pStyle w:val="Heading2"/>
       </w:pPr>
-      <w:bookmarkStart w:id="47" w:name="_Toc244207484"/>
+      <w:bookmarkStart w:id="47" w:name="_Toc244237134"/>
       <w:r>
         <w:t>10.1. User story theo chương (</w:t>
       </w:r>
@@ -34706,7 +34622,7 @@
       <w:pPr>
         <w:pStyle w:val="Heading2"/>
       </w:pPr>
-      <w:bookmarkStart w:id="48" w:name="_Toc244207485"/>
+      <w:bookmarkStart w:id="48" w:name="_Toc244237135"/>
       <w:r>
         <w:t>10.2. Ph</w:t>
       </w:r>
@@ -34748,7 +34664,7 @@
       <w:pPr>
         <w:pStyle w:val="Heading2"/>
       </w:pPr>
-      <w:bookmarkStart w:id="49" w:name="_Toc244207486"/>
+      <w:bookmarkStart w:id="49" w:name="_Toc244237136"/>
       <w:r>
         <w:t>10.3. Hư</w:t>
       </w:r>
@@ -34831,8 +34747,8 @@
       </w:r>
     </w:p>
     <w:sectPr>
-      <w:headerReference w:type="default" r:id="rId8"/>
-      <w:footerReference w:type="default" r:id="rId9"/>
+      <w:headerReference w:type="default" r:id="rId9"/>
+      <w:footerReference w:type="default" r:id="rId10"/>
       <w:pgSz w:w="11906" w:h="16838"/>
       <w:pgMar w:top="1417" w:right="1134" w:bottom="1417" w:left="1701" w:header="720" w:footer="720" w:gutter="0"/>
       <w:cols w:space="720"/>
@@ -34923,6 +34839,49 @@
   <w:p>
     <w:pPr>
       <w:pStyle w:val="Header"/>
+    </w:pPr>
+    <w:r>
+      <w:pict w14:anchorId="701DC2EC">
+        <v:shapetype id="_x0000_t136" coordsize="21600,21600" o:spt="136" adj="10800" path="m@7,l@8,m@5,21600l@6,21600e">
+          <v:formulas>
+            <v:f eqn="sum #0 0 10800"/>
+            <v:f eqn="prod #0 2 1"/>
+            <v:f eqn="sum 21600 0 @1"/>
+            <v:f eqn="sum 0 0 @2"/>
+            <v:f eqn="sum 21600 0 @3"/>
+            <v:f eqn="if @0 @3 0"/>
+            <v:f eqn="if @0 21600 @1"/>
+            <v:f eqn="if @0 0 @2"/>
+            <v:f eqn="if @0 @4 21600"/>
+            <v:f eqn="mid @5 @6"/>
+            <v:f eqn="mid @8 @5"/>
+            <v:f eqn="mid @7 @8"/>
+            <v:f eqn="mid @6 @7"/>
+            <v:f eqn="sum @6 0 @5"/>
+          </v:formulas>
+          <v:path textpathok="t" o:connecttype="custom" o:connectlocs="@9,0;@10,10800;@11,21600;@12,10800" o:connectangles="270,180,90,0"/>
+          <v:textpath on="t" fitshape="t"/>
+          <v:handles>
+            <v:h position="#0,bottomRight" xrange="6629,14971"/>
+          </v:handles>
+          <o:lock v:ext="edit" text="t" shapetype="t"/>
+        </v:shapetype>
+        <v:shape id="LhuWatermark" o:spid="_x0000_s1025" type="#_x0000_t136" style="position:absolute;margin-left:0;margin-top:0;width:470pt;height:70pt;rotation:315;z-index:-251659264;mso-position-horizontal:center;mso-position-horizontal-relative:margin;mso-position-vertical:center;mso-position-vertical-relative:margin" o:allowincell="f" fillcolor="#c8d3e6" stroked="f">
+          <v:fill opacity="22938f"/>
+          <v:textpath style="font-family:&quot;Arial&quot;;font-size:1pt" string="Công nghệ thông tin - LHU"/>
+          <w10:wrap anchorx="margin" anchory="margin"/>
+        </v:shape>
+      </w:pict>
+    </w:r>
+  </w:p>
+</w:hdr>
+</file>
+
+<file path=word/header2.xml><?xml version="1.0" encoding="utf-8"?>
+<w:hdr xmlns:wpc="http://schemas.microsoft.com/office/word/2010/wordprocessingCanvas" xmlns:cx="http://schemas.microsoft.com/office/drawing/2014/chartex" xmlns:cx1="http://schemas.microsoft.com/office/drawing/2015/9/8/chartex" xmlns:cx2="http://schemas.microsoft.com/office/drawing/2015/10/21/chartex" xmlns:cx3="http://schemas.microsoft.com/office/drawing/2016/5/9/chartex" xmlns:cx4="http://schemas.microsoft.com/office/drawing/2016/5/10/chartex" xmlns:cx5="http://schemas.microsoft.com/office/drawing/2016/5/11/chartex" xmlns:cx6="http://schemas.microsoft.com/office/drawing/2016/5/12/chartex" xmlns:cx7="http://schemas.microsoft.com/office/drawing/2016/5/13/chartex" xmlns:cx8="http://schemas.microsoft.com/office/drawing/2016/5/14/chartex" xmlns:mc="http://schemas.openxmlformats.org/markup-compatibility/2006" xmlns:aink="http://schemas.microsoft.com/office/drawing/2016/ink" xmlns:am3d="http://schemas.microsoft.com/office/drawing/2017/model3d" xmlns:o="urn:schemas-microsoft-com:office:office" xmlns:oel="http://schemas.microsoft.com/office/2019/extlst" xmlns:r="http://schemas.openxmlformats.org/officeDocument/2006/relationships" xmlns:m="http://schemas.openxmlformats.org/officeDocument/2006/math" xmlns:v="urn:schemas-microsoft-com:vml" xmlns:wp14="http://schemas.microsoft.com/office/word/2010/wordprocessingDrawing" xmlns:wp="http://schemas.openxmlformats.org/drawingml/2006/wordprocessingDrawing" xmlns:w10="urn:schemas-microsoft-com:office:word" xmlns:w="http://schemas.openxmlformats.org/wordprocessingml/2006/main" xmlns:w14="http://schemas.microsoft.com/office/word/2010/wordml" xmlns:w15="http://schemas.microsoft.com/office/word/2012/wordml" xmlns:w16cex="http://schemas.microsoft.com/office/word/2018/wordml/cex" xmlns:w16cid="http://schemas.microsoft.com/office/word/2016/wordml/cid" xmlns:w16="http://schemas.microsoft.com/office/word/2018/wordml" xmlns:w16du="http://schemas.microsoft.com/office/word/2023/wordml/word16du" xmlns:w16sdtdh="http://schemas.microsoft.com/office/word/2020/wordml/sdtdatahash" xmlns:w16sdtfl="http://schemas.microsoft.com/office/word/2024/wordml/sdtformatlock" xmlns:w16se="http://schemas.microsoft.com/office/word/2015/wordml/symex" xmlns:wpg="http://schemas.microsoft.com/office/word/2010/wordprocessingGroup" xmlns:wpi="http://schemas.microsoft.com/office/word/2010/wordprocessingInk" xmlns:wne="http://schemas.microsoft.com/office/word/2006/wordml" xmlns:wps="http://schemas.microsoft.com/office/word/2010/wordprocessingShape" mc:Ignorable="w14 w15 w16se w16cid w16 w16cex w16sdtdh w16sdtfl w16du wp14">
+  <w:p>
+    <w:pPr>
+      <w:pStyle w:val="Header"/>
       <w:jc w:val="right"/>
     </w:pPr>
     <w:r>
@@ -34932,6 +34891,39 @@
         <w:sz w:val="20"/>
       </w:rPr>
       <w:t>SRS LHU Food - Lập trình ứng dụng di động</w:t>
+    </w:r>
+    <w:r>
+      <w:pict w14:anchorId="40CBC68E">
+        <v:shapetype id="_x0000_t136" coordsize="21600,21600" o:spt="136" adj="10800" path="m@7,l@8,m@5,21600l@6,21600e">
+          <v:formulas>
+            <v:f eqn="sum #0 0 10800"/>
+            <v:f eqn="prod #0 2 1"/>
+            <v:f eqn="sum 21600 0 @1"/>
+            <v:f eqn="sum 0 0 @2"/>
+            <v:f eqn="sum 21600 0 @3"/>
+            <v:f eqn="if @0 @3 0"/>
+            <v:f eqn="if @0 21600 @1"/>
+            <v:f eqn="if @0 0 @2"/>
+            <v:f eqn="if @0 @4 21600"/>
+            <v:f eqn="mid @5 @6"/>
+            <v:f eqn="mid @8 @5"/>
+            <v:f eqn="mid @7 @8"/>
+            <v:f eqn="mid @6 @7"/>
+            <v:f eqn="sum @6 0 @5"/>
+          </v:formulas>
+          <v:path textpathok="t" o:connecttype="custom" o:connectlocs="@9,0;@10,10800;@11,21600;@12,10800" o:connectangles="270,180,90,0"/>
+          <v:textpath on="t" fitshape="t"/>
+          <v:handles>
+            <v:h position="#0,bottomRight" xrange="6629,14971"/>
+          </v:handles>
+          <o:lock v:ext="edit" text="t" shapetype="t"/>
+        </v:shapetype>
+        <v:shape id="_x0000_s1026" type="#_x0000_t136" style="position:absolute;left:0;text-align:left;margin-left:0;margin-top:0;width:470pt;height:70pt;rotation:315;z-index:-251658240;mso-position-horizontal:center;mso-position-horizontal-relative:margin;mso-position-vertical:center;mso-position-vertical-relative:margin" o:allowincell="f" fillcolor="#c8d3e6" stroked="f">
+          <v:fill opacity="22938f"/>
+          <v:textpath style="font-family:&quot;Arial&quot;;font-size:1pt" string="Công nghệ thông tin - LHU"/>
+          <w10:wrap anchorx="margin" anchory="margin"/>
+        </v:shape>
+      </w:pict>
     </w:r>
   </w:p>
 </w:hdr>
@@ -35110,31 +35102,31 @@
       </w:rPr>
     </w:lvl>
   </w:abstractNum>
-  <w:num w:numId="1" w16cid:durableId="1084648520">
+  <w:num w:numId="1" w16cid:durableId="2121412144">
     <w:abstractNumId w:val="8"/>
   </w:num>
-  <w:num w:numId="2" w16cid:durableId="1074553031">
+  <w:num w:numId="2" w16cid:durableId="210969176">
     <w:abstractNumId w:val="6"/>
   </w:num>
-  <w:num w:numId="3" w16cid:durableId="828983401">
+  <w:num w:numId="3" w16cid:durableId="1173301809">
     <w:abstractNumId w:val="5"/>
   </w:num>
-  <w:num w:numId="4" w16cid:durableId="954751197">
+  <w:num w:numId="4" w16cid:durableId="630476420">
     <w:abstractNumId w:val="4"/>
   </w:num>
-  <w:num w:numId="5" w16cid:durableId="1431899796">
+  <w:num w:numId="5" w16cid:durableId="847671409">
     <w:abstractNumId w:val="7"/>
   </w:num>
-  <w:num w:numId="6" w16cid:durableId="27069062">
+  <w:num w:numId="6" w16cid:durableId="1601838565">
     <w:abstractNumId w:val="3"/>
   </w:num>
-  <w:num w:numId="7" w16cid:durableId="1959988330">
+  <w:num w:numId="7" w16cid:durableId="984897563">
     <w:abstractNumId w:val="2"/>
   </w:num>
-  <w:num w:numId="8" w16cid:durableId="600145133">
+  <w:num w:numId="8" w16cid:durableId="864169404">
     <w:abstractNumId w:val="1"/>
   </w:num>
-  <w:num w:numId="9" w16cid:durableId="211771483">
+  <w:num w:numId="9" w16cid:durableId="927422168">
     <w:abstractNumId w:val="0"/>
   </w:num>
 </w:numbering>
@@ -46525,7 +46517,7 @@
     <w:autoRedefine/>
     <w:uiPriority w:val="39"/>
     <w:unhideWhenUsed/>
-    <w:rsid w:val="0097766D"/>
+    <w:rsid w:val="000F2952"/>
     <w:pPr>
       <w:spacing w:after="100"/>
     </w:pPr>
@@ -46537,7 +46529,7 @@
     <w:autoRedefine/>
     <w:uiPriority w:val="39"/>
     <w:unhideWhenUsed/>
-    <w:rsid w:val="0097766D"/>
+    <w:rsid w:val="000F2952"/>
     <w:pPr>
       <w:spacing w:after="100"/>
       <w:ind w:left="260"/>
@@ -46548,7 +46540,7 @@
     <w:basedOn w:val="DefaultParagraphFont"/>
     <w:uiPriority w:val="99"/>
     <w:unhideWhenUsed/>
-    <w:rsid w:val="0097766D"/>
+    <w:rsid w:val="000F2952"/>
     <w:rPr>
       <w:color w:val="0000FF" w:themeColor="hyperlink"/>
       <w:u w:val="single"/>

</xml_diff>